<commit_message>
llm class and emaill llm class
</commit_message>
<xml_diff>
--- a/documents/Auto_Email_Churn_Retention_SRS.docx
+++ b/documents/Auto_Email_Churn_Retention_SRS.docx
@@ -1515,7 +1515,7 @@
           </w:tcPr>
           <w:p>
             <w:r>
-              <w:t>In Progress</w:t>
+              <w:t>Done</w:t>
             </w:r>
           </w:p>
         </w:tc>
@@ -1616,7 +1616,11 @@
           <w:tcPr>
             <w:tcW w:w="1468" w:type="pct"/>
           </w:tcPr>
-          <w:p/>
+          <w:p>
+            <w:r>
+              <w:t>Done</w:t>
+            </w:r>
+          </w:p>
         </w:tc>
       </w:tr>
       <w:tr>

</xml_diff>